<commit_message>
v1.1.0: revision after review - past-light-cone survival, error budget, scope of the reheating bound
Survival of the present vacuum is evaluated on the Lorentzian past light cone (V4 = 0.059 H^-4, 445x below the Euclidean four-sphere);
adds convergence/negative-mode analysis, prefactor systematics, scope of the reheating bound (curvature parameter, AdS, reservoirs),
a coupling-independent matter-trigger requirement, consistency conditions vs observational tests, literature comparison, new title,
declarations in the LaTeX source, fixed LaTeX tables, and 5 new executable checks (18 total).

Co-Authored-By: Claude Sonnet 5.5 <noreply@anthropic.com>
</commit_message>
<xml_diff>
--- a/manuscript/EPJC_Cover_Letter.docx
+++ b/manuscript/EPJC_Cover_Letter.docx
@@ -115,7 +115,7 @@
         <w:rPr>
           <w:b w:val="0"/>
         </w:rPr>
-        <w:t>I submit the manuscript “Late-Time Vacuum Decay and Cosmological Reheating: Gravitational Tunneling, Stochastic Sensitivity, and Falsification Boundaries” as a Regular Article (Theoretical Physics) for consideration in The European Physical Journal C.</w:t>
+        <w:t>I submit the manuscript “Late-Time Vacuum Decay as a Cosmological Reset: Coleman–De Luccia Tunneling, Reheating Constraints, and Consistency Boundaries” as a Regular Article (Theoretical Physics) for consideration in The European Physical Journal C.</w:t>
       </w:r>
     </w:p>
     <w:p>
@@ -123,7 +123,7 @@
         <w:rPr>
           <w:b w:val="0"/>
         </w:rPr>
-        <w:t>The paper asks a question that is often posed informally: can the decay of a metastable late-time vacuum seed a new cosmological cycle? It treats the question as a calculation. A scalar potential with an explicit metastable minimum is specified, the Coleman–De Luccia bounce is solved numerically in flat space and with Einstein gravity, and the action is converted to a nucleation rate per Hubble four-volume with the measured dark-energy density as the false-vacuum energy. The result is a set of quantitative boundaries rather than a prediction: with all scales set by the dark energy, gravity and the Hawking–Moss channel play no role (the gravitational parameter is of order 10⁻⁶⁰) and the decay is a flat-space process controlled by a single action, which must lie within a narrow window near 287 for the transition to be neither excluded by the survival of the present vacuum nor effectively absent. Energy conservation then bounds the reheating of the nucleated region to about 2 meV, some nine orders of magnitude below nucleosynthesis, so that a hot big bang cannot be regenerated by the decay of the present dark energy; and a trigger by the dilution of matter would require a scalar–matter coupling some 28 to 30 orders of magnitude larger than allowed.</w:t>
+        <w:t>The paper tests a proposal that is often stated informally: that the decay of a metastable late-time vacuum could reset the cosmological history. It is treated as a calculation, and the answer is largely negative. A scalar potential with an explicit metastable minimum is specified, the Coleman–De Luccia bounce is solved numerically in flat space and with Einstein gravity, and the action is converted to a nucleation rate with the measured dark-energy density as the false-vacuum energy. With all scales set by the dark energy the gravitational parameter is of order 10⁻⁶⁰, so gravity and the Hawking–Moss channel play no role and the decay is controlled by a single action, which must lie near 287 for a transition on cosmological time scales. The survival of the present vacuum is evaluated on the Lorentzian past light cone of the observed expansion history (0.059 Hubble four-volumes, 445 times smaller than the Euclidean four-sphere often used as a shortcut), which makes the survival condition a weak one. The nucleated region reheats to at most about 2.2 meV, and the reason is not only energy conservation: the open interior stays curvature dominated, so that a hot epoch at one second would require a parent energy scale at least 41 orders of magnitude above the Planck scale. A trigger by matter dilution requires a change of the matter mass between the vacua of at least about 0.1%.</w:t>
       </w:r>
     </w:p>
     <w:p>
@@ -131,7 +131,7 @@
         <w:rPr>
           <w:b w:val="0"/>
         </w:rPr>
-        <w:t>The conclusions are largely negative for the cyclic-reset hypothesis in its simplest form, and the paper says so. Its contribution is the explicit, reproducible calculation chain, with the failure regions stated and a prior-sensitivity Monte Carlo with convergence tests, and a list of falsification conditions that can be recomputed for any other potential. I believe this fits the scope of EPJ C in cosmology, quantum field theory in curved space and gravitation.</w:t>
+        <w:t>I want to be clear about novelty. The bounce, Hawking–Moss and thin-wall results, the past-light-cone survival method, open-universe interiors and screened couplings are established, and are cited as such; Table 1 of the manuscript lists, for each ingredient, what is known and what is added. What is new is the quantitative combination for the dark-energy vacuum: an explicit map from potential parameters to decay times with a numerical error budget and negative-mode check; the survival bound on the past light cone and the corrected width of the transition window; a statement of which energy sources the reheating bound excludes by geometry and which only by energy conservation; a coupling-independent requirement on any matter trigger; and a separation of internal consistency conditions from observational tests. The paper does not claim to establish a cyclic cosmology; it shows that tunneling of the present dark energy is not a viable reset in the class studied, and it states what would have to change.</w:t>
       </w:r>
     </w:p>
     <w:p>
@@ -139,7 +139,7 @@
         <w:rPr>
           <w:b w:val="0"/>
         </w:rPr>
-        <w:t>The analysis is fully reproducible. The code (Python, MIT licence) and the data behind every figure and table are at https://github.com/sandlerleon/late-time-vacuum-decay and archived at https://doi.org/10.5281/zenodo.23717619; the manuscript is archived at https://doi.org/10.5281/zenodo.23717617. The repository contains 13 executable checks of the numerical machinery (against the thin-wall limit, an independent boundary-value solver, the exact de Sitter action, the analytic gravitational suppression and the Hawking–Moss criterion) and the manuscript is built from the stored results, so the text cannot diverge from the computation.</w:t>
+        <w:t>The analysis is fully reproducible. The code (Python, MIT licence) and the data behind every figure and table are at https://github.com/sandlerleon/late-time-vacuum-decay and archived at https://doi.org/10.5281/zenodo.23751350; the manuscript is archived at https://doi.org/10.5281/zenodo.23751349. The repository contains 18 executable checks (against the thin-wall limit, an independent boundary-value solver, the exact de Sitter action, the analytic gravitational suppression, the Hawking–Moss criterion, the negative-mode structure, the past-light-cone volume and the scope estimates), and the manuscript is built from the stored results, so the text cannot diverge from the computation.</w:t>
       </w:r>
     </w:p>
     <w:p>
@@ -147,7 +147,7 @@
         <w:rPr>
           <w:b w:val="0"/>
         </w:rPr>
-        <w:t>I want to be explicit about the status of the work. It uses no observational data other than the measured dark-energy density and the Planck cosmological parameters, and it does not claim to predict the fate of our universe. The Monte Carlo describes the sample space of a stated family of potentials and priors, not a probability of a transition. A generative AI tool (Claude, Anthropic) was used to assist with the design of the numerical analysis, the code, literature checking and drafting; I reviewed and checked all of it, and I take full responsibility for the content. This is disclosed in the manuscript.</w:t>
+        <w:t>The work uses no observational data other than the measured dark-energy density and the Planck cosmological parameters, and it does not claim to predict the fate of our universe. The Monte Carlo describes the sample space of a stated family of potentials and priors, not a probability of a transition. A generative AI tool (Claude, Anthropic) was used to assist with the design of the numerical analysis, the code, literature checking and drafting; I reviewed and checked all of it, and I take full responsibility for the content. This is disclosed in the manuscript.</w:t>
       </w:r>
     </w:p>
     <w:p>

</xml_diff>

<commit_message>
v1.2.0: finite-temperature analysis, daughter-universe framing, new title
Adds the thermal mass with exact rescaling of the tilted quartic potential, the O(3) action table, O(3)/O(4) crossover, survival with a time-dependent
rate on the past light cone and thermal prior maps (decoupled vs equilibrated scalar); two-field energy-budget argument; daughter-region versus cyclic
distinction (Options A/B); consistency condition C7 and test O6; 3 new executable checks (21 total); figures 6-7 are new and the reheating/curvature
figures are now 8-9.

Co-Authored-By: Claude Sonnet 5.5 <noreply@anthropic.com>
</commit_message>
<xml_diff>
--- a/manuscript/EPJC_Cover_Letter.docx
+++ b/manuscript/EPJC_Cover_Letter.docx
@@ -115,7 +115,7 @@
         <w:rPr>
           <w:b w:val="0"/>
         </w:rPr>
-        <w:t>I submit the manuscript “Late-Time Vacuum Decay as a Cosmological Reset: Coleman–De Luccia Tunneling, Reheating Constraints, and Consistency Boundaries” as a Regular Article (Theoretical Physics) for consideration in The European Physical Journal C.</w:t>
+        <w:t>I submit the manuscript “Daughter-Universe Nucleation from a Metastable Dark-Energy Vacuum: Thermal and Quantum Decay, Past-Light-Cone Survival, and Reheating Bounds” as a Regular Article (Theoretical Physics) for consideration in The European Physical Journal C.</w:t>
       </w:r>
     </w:p>
     <w:p>
@@ -131,6 +131,14 @@
         <w:rPr>
           <w:b w:val="0"/>
         </w:rPr>
+        <w:t>Cosmological cooling is treated explicitly. A scalar coupled to the CMB acquires a thermal mass, which rescales the tilted quartic potential exactly; the quantum (O(4)) and thermal (O(3)) exponents are compared, and the survival probability is computed with the time-dependent rate on the past light cone. Cooling lowers the thermal channel monotonically and cannot raise the late-time probability of a transition: a scalar decoupled from the CMB is unaffected, and one in equilibrium with it is more strongly constrained (24% to 49% of the prior excluded against 15%) with no late-time decay window left. The conclusion is therefore about daughter regions of the present dark energy, which are cold and empty, and not about a cyclic cosmology.</w:t>
+      </w:r>
+    </w:p>
+    <w:p>
+      <w:r>
+        <w:rPr>
+          <w:b w:val="0"/>
+        </w:rPr>
         <w:t>I want to be clear about novelty. The bounce, Hawking–Moss and thin-wall results, the past-light-cone survival method, open-universe interiors and screened couplings are established, and are cited as such; Table 1 of the manuscript lists, for each ingredient, what is known and what is added. What is new is the quantitative combination for the dark-energy vacuum: an explicit map from potential parameters to decay times with a numerical error budget and negative-mode check; the survival bound on the past light cone and the corrected width of the transition window; a statement of which energy sources the reheating bound excludes by geometry and which only by energy conservation; a coupling-independent requirement on any matter trigger; and a separation of internal consistency conditions from observational tests. The paper does not claim to establish a cyclic cosmology; it shows that tunneling of the present dark energy is not a viable reset in the class studied, and it states what would have to change.</w:t>
       </w:r>
     </w:p>
@@ -139,7 +147,7 @@
         <w:rPr>
           <w:b w:val="0"/>
         </w:rPr>
-        <w:t>The analysis is fully reproducible. The code (Python, MIT licence) and the data behind every figure and table are at https://github.com/sandlerleon/late-time-vacuum-decay and archived at https://doi.org/10.5281/zenodo.23751350; the manuscript is archived at https://doi.org/10.5281/zenodo.23751349. The repository contains 18 executable checks (against the thin-wall limit, an independent boundary-value solver, the exact de Sitter action, the analytic gravitational suppression, the Hawking–Moss criterion, the negative-mode structure, the past-light-cone volume and the scope estimates), and the manuscript is built from the stored results, so the text cannot diverge from the computation.</w:t>
+        <w:t>The analysis is fully reproducible. The code (Python, MIT licence) and the data behind every figure and table are at https://github.com/sandlerleon/late-time-vacuum-decay and archived at https://doi.org/10.5281/zenodo.23752471; the manuscript is archived at https://doi.org/10.5281/zenodo.23752470. The repository contains 21 executable checks (against the thin-wall limit, an independent boundary-value solver, the exact de Sitter action, the analytic gravitational suppression, the Hawking–Moss criterion, the negative-mode structure, the past-light-cone volume and the scope estimates), and the manuscript is built from the stored results, so the text cannot diverge from the computation.</w:t>
       </w:r>
     </w:p>
     <w:p>

</xml_diff>

<commit_message>
Steps 6-7: Lorentzian simulations of the daughter region (pre-release snapshot)
Co-Authored-By: Claude Sonnet 5.5 <noreply@anthropic.com>
</commit_message>
<xml_diff>
--- a/manuscript/EPJC_Cover_Letter.docx
+++ b/manuscript/EPJC_Cover_Letter.docx
@@ -69,7 +69,7 @@
         <w:rPr>
           <w:b w:val="0"/>
         </w:rPr>
-        <w:t>28 October 2026</w:t>
+        <w:t>29 October 2026</w:t>
       </w:r>
     </w:p>
     <w:p>
@@ -139,6 +139,14 @@
         <w:rPr>
           <w:b w:val="0"/>
         </w:rPr>
+        <w:t>The interior of the nucleated region is simulated, not only bounded: Lorentzian evolution of one and two fields with dissipation and gravity (constraint residual at most 1e-8), a reservoir hidden by a negative vacuum offset, hilltop flattening at the dark-energy scale, a chain of repeated transitions with the energy sum rule, and entropy accounting. They give the criteria of Table 13 for a viable daughter universe, which no scenario with the observed dark energy as the parent satisfies.</w:t>
+      </w:r>
+    </w:p>
+    <w:p>
+      <w:r>
+        <w:rPr>
+          <w:b w:val="0"/>
+        </w:rPr>
         <w:t>I want to be clear about novelty. The bounce, Hawking–Moss and thin-wall results, the past-light-cone survival method, open-universe interiors and screened couplings are established, and are cited as such; Table 1 of the manuscript lists, for each ingredient, what is known and what is added. What is new is the quantitative combination for the dark-energy vacuum: an explicit map from potential parameters to decay times with a numerical error budget and negative-mode check; the survival bound on the past light cone and the corrected width of the transition window; a statement of which energy sources the reheating bound excludes by geometry and which only by energy conservation; a coupling-independent requirement on any matter trigger; and a separation of internal consistency conditions from observational tests. The paper does not claim to establish a cyclic cosmology; it shows that tunneling of the present dark energy is not a viable reset in the class studied, and it states what would have to change.</w:t>
       </w:r>
     </w:p>
@@ -147,7 +155,7 @@
         <w:rPr>
           <w:b w:val="0"/>
         </w:rPr>
-        <w:t>The analysis is fully reproducible. The code (Python, MIT licence) and the data behind every figure and table are at https://github.com/sandlerleon/late-time-vacuum-decay and archived at https://doi.org/10.5281/zenodo.23752471; the manuscript is archived at https://doi.org/10.5281/zenodo.23752470. The repository contains 21 executable checks (against the thin-wall limit, an independent boundary-value solver, the exact de Sitter action, the analytic gravitational suppression, the Hawking–Moss criterion, the negative-mode structure, the past-light-cone volume and the scope estimates), and the manuscript is built from the stored results, so the text cannot diverge from the computation.</w:t>
+        <w:t>The analysis is fully reproducible. The code (Python, MIT licence) and the data behind every figure and table are at https://github.com/sandlerleon/late-time-vacuum-decay and archived at https://doi.org/10.5281/zenodo.23752471; the manuscript is archived at https://doi.org/10.5281/zenodo.23752470. The repository contains 24 executable checks (against the thin-wall limit, an independent boundary-value solver, the exact de Sitter action, the analytic gravitational suppression, the Hawking–Moss criterion, the negative-mode structure, the past-light-cone volume and the scope estimates), and the manuscript is built from the stored results, so the text cannot diverge from the computation.</w:t>
       </w:r>
     </w:p>
     <w:p>

</xml_diff>

<commit_message>
v1.4.0: Option B (oscillating cycles with an effective bounce)
Section 5.6, Table 14, Figs 11-12: effective LQC bounce with the AdS turnaround,
sinusoid analysis, periodic radiation-only cycles, scalar amplification
(cosmological hysteresis) validated with three integrators, bounce continuity and
constraint residuals, the law Delta a_max = W/3, 100-1000-cycle phase diagram,
second bounce prescription, vacuum transitions during the cycles (Models A/B/C).
Per-cycle CSV and config; checks V25-V26 (26 total); new title; reserved DOIs.

Co-Authored-By: Claude Opus 5.5 <noreply@anthropic.com>
</commit_message>
<xml_diff>
--- a/manuscript/EPJC_Cover_Letter.docx
+++ b/manuscript/EPJC_Cover_Letter.docx
@@ -147,6 +147,14 @@
         <w:rPr>
           <w:b w:val="0"/>
         </w:rPr>
+        <w:t>The same region oscillating (Option B) is tested as well, with an effective loop-quantum-cosmology bounce and the turnaround supplied by the decay to anti-de Sitter: radiation-only cycles are periodic over a thousand bounces, but a scalar excitation is amplified at every bounce, the turnaround radius follows the energy-balance law Delta a_max = W/3 with W the pressure-volume loop, the cycles are stable only when dissipation per cycle exceeds the logarithm of the amplification, and a vacuum transition during the cycles destabilises them. Cosmological hysteresis itself is known; the stability boundary, the law in this setting and the effect of a transition are what the paper adds.</w:t>
+      </w:r>
+    </w:p>
+    <w:p>
+      <w:r>
+        <w:rPr>
+          <w:b w:val="0"/>
+        </w:rPr>
         <w:t>I want to be clear about novelty. The bounce, Hawking–Moss and thin-wall results, the past-light-cone survival method, open-universe interiors and screened couplings are established, and are cited as such; Table 1 of the manuscript lists, for each ingredient, what is known and what is added. What is new is the quantitative combination for the dark-energy vacuum: an explicit map from potential parameters to decay times with a numerical error budget and negative-mode check; the survival bound on the past light cone and the corrected width of the transition window; a statement of which energy sources the reheating bound excludes by geometry and which only by energy conservation; a coupling-independent requirement on any matter trigger; and a separation of internal consistency conditions from observational tests. The paper does not claim to establish a cyclic cosmology; it shows that tunneling of the present dark energy is not a viable reset in the class studied, and it states what would have to change.</w:t>
       </w:r>
     </w:p>
@@ -155,7 +163,7 @@
         <w:rPr>
           <w:b w:val="0"/>
         </w:rPr>
-        <w:t>The analysis is fully reproducible. The code (Python, MIT licence) and the data behind every figure and table are at https://github.com/sandlerleon/late-time-vacuum-decay and archived at https://doi.org/10.5281/zenodo.23785651; the manuscript is archived at https://doi.org/10.5281/zenodo.23785648. The repository contains 24 executable checks (against the thin-wall limit, an independent boundary-value solver, the exact de Sitter action, the analytic gravitational suppression, the Hawking–Moss criterion, the negative-mode structure, the past-light-cone volume and the scope estimates), and the manuscript is built from the stored results, so the text cannot diverge from the computation.</w:t>
+        <w:t>The analysis is fully reproducible. The code (Python, MIT licence) and the data behind every figure and table are at https://github.com/sandlerleon/late-time-vacuum-decay and archived at https://doi.org/10.5281/zenodo.23788614; the manuscript is archived at https://doi.org/10.5281/zenodo.23788613. The repository contains 26 executable checks (against the thin-wall limit, an independent boundary-value solver, the exact de Sitter action, the analytic gravitational suppression, the Hawking–Moss criterion, the negative-mode structure, the past-light-cone volume and the scope estimates), and the manuscript is built from the stored results, so the text cannot diverge from the computation.</w:t>
       </w:r>
     </w:p>
     <w:p>

</xml_diff>

<commit_message>
v1.5.0: cyclic hot big bang triggered by matter dilution (new main direction)
Section 6 rebuilt around a matter-held vacuum: a dark-matter coupling holds the
observed dark energy, dilution releases it into a negative vacuum and the
expansion turns around (200-run grid against an uncoupled control); cooling vs
dilution as the trigger; tunneling branch in which dilution opens the survival
window; cold cycles (kinetic-dominated, fail) and hot cycles with an effective
bounce, thermal dissipation and dark-matter freeze-out (self-similar, growth =
entropy^(1/3)). Tables 16-17, Figs 13-16, checks V27-V28 (28), new title,
abstract, introduction and conclusions; reserved DOIs.

Co-Authored-By: Claude Opus 5.5 <noreply@anthropic.com>
</commit_message>
<xml_diff>
--- a/manuscript/EPJC_Cover_Letter.docx
+++ b/manuscript/EPJC_Cover_Letter.docx
@@ -69,7 +69,7 @@
         <w:rPr>
           <w:b w:val="0"/>
         </w:rPr>
-        <w:t>29 October 2026</w:t>
+        <w:t>30 October 2026</w:t>
       </w:r>
     </w:p>
     <w:p>
@@ -115,7 +115,7 @@
         <w:rPr>
           <w:b w:val="0"/>
         </w:rPr>
-        <w:t>I submit the manuscript “Daughter-Universe Nucleation from a Metastable Dark-Energy Vacuum: Thermal and Quantum Decay, Past-Light-Cone Survival, and Reheating Bounds” as a Regular Article (Theoretical Physics) for consideration in The European Physical Journal C.</w:t>
+        <w:t>I submit the manuscript “A Cyclic Hot Big Bang Triggered by Matter Dilution: Metastable Dark Energy, Vacuum Release, Recollapse and Self-Similar Nonsingular Cycles” as a Regular Article (Theoretical Physics) for consideration in The European Physical Journal C.</w:t>
       </w:r>
     </w:p>
     <w:p>
@@ -123,7 +123,15 @@
         <w:rPr>
           <w:b w:val="0"/>
         </w:rPr>
-        <w:t>The paper tests a proposal that is often stated informally: that the decay of a metastable late-time vacuum could reset the cosmological history. It is treated as a calculation, and the answer is largely negative. A scalar potential with an explicit metastable minimum is specified, the Coleman–De Luccia bounce is solved numerically in flat space and with Einstein gravity, and the action is converted to a nucleation rate with the measured dark-energy density as the false-vacuum energy. With all scales set by the dark energy the gravitational parameter is of order 10⁻⁶⁰, so gravity and the Hawking–Moss channel play no role and the decay is controlled by a single action, which must lie near 287 for a transition on cosmological time scales. The survival of the present vacuum is evaluated on the Lorentzian past light cone of the observed expansion history (0.059 Hubble four-volumes, 445 times smaller than the Euclidean four-sphere often used as a shortcut), which makes the survival condition a weak one. The nucleated region reheats to at most about 2.2 meV, and the reason is not only energy conservation: the open interior stays curvature dominated, so that a hot epoch at one second would require a parent energy scale at least 41 orders of magnitude above the Planck scale. A trigger by matter dilution requires a change of the matter mass between the vacua of at least about 0.1%.</w:t>
+        <w:t>The paper asks whether the present dark energy can end the cosmological expansion and start a new hot big bang, and answers in two parts. The direct route, tunneling of a metastable dark-energy vacuum, fails for reasons that are quantified below. The paper then constructs a route that works within an explicit model: a scalar coupled to dark matter holds the vacuum at the observed dark-energy density while the matter density is high, and the dilution of the matter releases it into a negative vacuum, so that the expansion turns around with a LambdaCDM past that an uncoupled field cannot reproduce. With an effective loop-quantum-cosmology bounce, thermal dissipation in the hot contraction and the re-thermalization and freeze-out of dark matter, the cycles are self-similar: every cycle has a radiation-dominated bounce, a matter era, a dark-energy epoch of 3.6 e-folds and a release at the same temperature, while the entropy produced enlarges the next cycle by exactly (S_n+1/S_n)^(1/3) = 231.8, as the second law requires. Removing the dissipation or the freeze-out destroys the cycles, and cooling cannot replace dilution as the trigger. The model predicts w = -1 until the release, no fifth force today and a future recollapse, and it is bounded by the deepest cosmic voids.</w:t>
+      </w:r>
+    </w:p>
+    <w:p>
+      <w:r>
+        <w:rPr>
+          <w:b w:val="0"/>
+        </w:rPr>
+        <w:t>For the direct route the answer is negative. A scalar potential with an explicit metastable minimum is specified, the Coleman–De Luccia bounce is solved numerically in flat space and with Einstein gravity, and the action is converted to a nucleation rate with the measured dark-energy density as the false-vacuum energy. With all scales set by the dark energy the gravitational parameter is of order 10⁻⁶⁰, so gravity and the Hawking–Moss channel play no role and the decay is controlled by a single action, which must lie near 287 for a transition on cosmological time scales. The survival of the present vacuum is evaluated on the Lorentzian past light cone of the observed expansion history (0.059 Hubble four-volumes, 445 times smaller than the Euclidean four-sphere often used as a shortcut), which makes the survival condition a weak one. The nucleated region reheats to at most about 2.2 meV, and the reason is not only energy conservation: the open interior stays curvature dominated, so that a hot epoch at one second would require a parent energy scale at least 41 orders of magnitude above the Planck scale. A trigger by matter dilution requires a change of the matter mass between the vacua of at least about 0.1%.</w:t>
       </w:r>
     </w:p>
     <w:p>
@@ -155,6 +163,14 @@
         <w:rPr>
           <w:b w:val="0"/>
         </w:rPr>
+        <w:t>I want to be clear about novelty here as well. The symmetron-type coupling, coupled dark matter, warm-inflation dissipation, thermal freeze-out, the effective bounce and Tolman's growing cycles are established and cited. What the paper adds is their combination into a cycle that contains a hot big bang and an epoch like ours, the exact energy relation that fixes how much the dark-matter mass must grow at the release, the comparison with an uncoupled control and with cooling as an alternative trigger, the tunneling branch in which dilution opens the survival window, and the identification of the ingredients without which the cycles fail. The result is a demonstration within a model, with its limits stated (effective bounce, a bounce density far below the Planck value, homogeneous dynamics), not a claim that the universe is cyclic.</w:t>
+      </w:r>
+    </w:p>
+    <w:p>
+      <w:r>
+        <w:rPr>
+          <w:b w:val="0"/>
+        </w:rPr>
         <w:t>I want to be clear about novelty. The bounce, Hawking–Moss and thin-wall results, the past-light-cone survival method, open-universe interiors and screened couplings are established, and are cited as such; Table 1 of the manuscript lists, for each ingredient, what is known and what is added. What is new is the quantitative combination for the dark-energy vacuum: an explicit map from potential parameters to decay times with a numerical error budget and negative-mode check; the survival bound on the past light cone and the corrected width of the transition window; a statement of which energy sources the reheating bound excludes by geometry and which only by energy conservation; a coupling-independent requirement on any matter trigger; and a separation of internal consistency conditions from observational tests. The paper does not claim to establish a cyclic cosmology; it shows that tunneling of the present dark energy is not a viable reset in the class studied, and it states what would have to change.</w:t>
       </w:r>
     </w:p>
@@ -163,7 +179,7 @@
         <w:rPr>
           <w:b w:val="0"/>
         </w:rPr>
-        <w:t>The analysis is fully reproducible. The code (Python, MIT licence) and the data behind every figure and table are at https://github.com/sandlerleon/late-time-vacuum-decay and archived at https://doi.org/10.5281/zenodo.23788614; the manuscript is archived at https://doi.org/10.5281/zenodo.23788613. The repository contains 26 executable checks (against the thin-wall limit, an independent boundary-value solver, the exact de Sitter action, the analytic gravitational suppression, the Hawking–Moss criterion, the negative-mode structure, the past-light-cone volume and the scope estimates), and the manuscript is built from the stored results, so the text cannot diverge from the computation.</w:t>
+        <w:t>The analysis is fully reproducible. The code (Python, MIT licence) and the data behind every figure and table are at https://github.com/sandlerleon/late-time-vacuum-decay and archived at https://doi.org/10.5281/zenodo.23794069; the manuscript is archived at https://doi.org/10.5281/zenodo.23794065. The repository contains 28 executable checks (against the thin-wall limit, an independent boundary-value solver, the exact de Sitter action, the analytic gravitational suppression, the Hawking–Moss criterion, the negative-mode structure, the past-light-cone volume and the scope estimates), and the manuscript is built from the stored results, so the text cannot diverge from the computation.</w:t>
       </w:r>
     </w:p>
     <w:p>

</xml_diff>

<commit_message>
v1.6.0: nonsingular cycles without resets
Continuous reheating (Boltzmann dark matter with field-dependent mass, T^3
dissipation, LQC bounce), 100 cycles with no reset of any variable; return
map with an attracting fixed point; closed-form held epoch; numerical
admissibility (projection needed, its frequency immaterial); causal
interventions; Bianchi I shear and ekpyrosis; bounce validation; black-hole
relics; observational consequences. Sections 6.8-6.15, Tables 18-19,
Figs 17-22, checks V29-V32 (32 in total). Zenodo DOIs linked.

Co-Authored-By: Claude Opus 5.5 <noreply@anthropic.com>
</commit_message>
<xml_diff>
--- a/manuscript/EPJC_Cover_Letter.docx
+++ b/manuscript/EPJC_Cover_Letter.docx
@@ -115,7 +115,7 @@
         <w:rPr>
           <w:b w:val="0"/>
         </w:rPr>
-        <w:t>I submit the manuscript “A Cyclic Hot Big Bang Triggered by Matter Dilution: Metastable Dark Energy, Vacuum Release, Recollapse and Self-Similar Nonsingular Cycles” as a Regular Article (Theoretical Physics) for consideration in The European Physical Journal C.</w:t>
+        <w:t>I submit the manuscript “A Cyclic Hot Big Bang Triggered by Matter Dilution: Metastable Dark Energy, Vacuum Release, Recollapse and Nonsingular Cycles without Resets” as a Regular Article (Theoretical Physics) for consideration in The European Physical Journal C.</w:t>
       </w:r>
     </w:p>
     <w:p>
@@ -123,7 +123,7 @@
         <w:rPr>
           <w:b w:val="0"/>
         </w:rPr>
-        <w:t>The paper asks whether the present dark energy can end the cosmological expansion and start a new hot big bang, and answers in two parts. The direct route, tunneling of a metastable dark-energy vacuum, fails for reasons that are quantified below. The paper then constructs a route that works within an explicit model: a scalar coupled to dark matter holds the vacuum at the observed dark-energy density while the matter density is high, and the dilution of the matter releases it into a negative vacuum, so that the expansion turns around with a LambdaCDM past that an uncoupled field cannot reproduce. With an effective loop-quantum-cosmology bounce, thermal dissipation in the hot contraction and the re-thermalization and freeze-out of dark matter, the cycles are self-similar: every cycle has a radiation-dominated bounce, a matter era, a dark-energy epoch of 3.6 e-folds and a release at the same temperature, while the entropy produced enlarges the next cycle by exactly (S_n+1/S_n)^(1/3) = 231.8, as the second law requires. Removing the dissipation or the freeze-out destroys the cycles, and cooling cannot replace dilution as the trigger. The model predicts w = -1 until the release, no fifth force today and a future recollapse, and it is bounded by the deepest cosmic voids.</w:t>
+        <w:t>The paper asks whether the present dark energy can end the cosmological expansion and start a new hot big bang. The direct route, tunneling of a metastable dark-energy vacuum, fails for reasons that are quantified below. A vacuum held by dark matter and released by dilution does end the expansion: the turnaround follows an exact LambdaCDM past, and an intervention that freezes the matter density seen by the field removes it, so dilution is its cause. This revision then removes every prescribed step from the cycle. With an effective bounce, thermal dissipation and dark matter that obeys its own Boltzmann equation, 100 consecutive cycles were integrated with no reset of any variable; each has a radiation-dominated bounce, a freeze-out to the observed dark-matter ratio, a matter era, a dark-energy epoch and a turnaround, and the entropy produced enlarges the next cycle by (S_n+1/S_n)^(1/3). The revision also reports what the earlier prescribed resets had hidden: a bounce too cold to re-thermalize the dark matter gives an empty next cycle. It adds the conditions on anisotropy (with and without an ekpyrotic phase), an independent bounce mechanism, the black holes of the previous cycle (which bound the bounce temperature from above), a failure-mode map, and the observational consequences, including the negative one that the cycle does not produce the observed primordial perturbations.</w:t>
       </w:r>
     </w:p>
     <w:p>
@@ -163,7 +163,7 @@
         <w:rPr>
           <w:b w:val="0"/>
         </w:rPr>
-        <w:t>I want to be clear about novelty here as well. The symmetron-type coupling, coupled dark matter, warm-inflation dissipation, thermal freeze-out, the effective bounce and Tolman's growing cycles are established and cited. What the paper adds is their combination into a cycle that contains a hot big bang and an epoch like ours, the exact energy relation that fixes how much the dark-matter mass must grow at the release, the comparison with an uncoupled control and with cooling as an alternative trigger, the tunneling branch in which dilution opens the survival window, and the identification of the ingredients without which the cycles fail. The result is a demonstration within a model, with its limits stated (effective bounce, a bounce density far below the Planck value, homogeneous dynamics), not a claim that the universe is cyclic.</w:t>
+        <w:t>I want to be clear about novelty here as well. The symmetron-type coupling, coupled dark matter, warm-inflation dissipation, thermal freeze-out, the effective bounce and Tolman's growing cycles are established and cited. What the paper adds is their combination into a cycle that contains a hot big bang and an epoch like ours, followed over 100 cycles without any reset, the exact energy relation that fixes how much the dark-matter mass must grow at the release, the comparison with an uncoupled control and with cooling as an alternative trigger, the tunneling branch in which dilution opens the survival window, and the identification of the ingredients without which the cycles fail. The result is a demonstration within a model, with its limits stated (effective bounce, a bounce density far below the Planck value, homogeneous dynamics), not a claim that the universe is cyclic.</w:t>
       </w:r>
     </w:p>
     <w:p>
@@ -179,7 +179,7 @@
         <w:rPr>
           <w:b w:val="0"/>
         </w:rPr>
-        <w:t>The analysis is fully reproducible. The code (Python, MIT licence) and the data behind every figure and table are at https://github.com/sandlerleon/late-time-vacuum-decay and archived at https://doi.org/10.5281/zenodo.23794069; the manuscript is archived at https://doi.org/10.5281/zenodo.23794065. The repository contains 28 executable checks (against the thin-wall limit, an independent boundary-value solver, the exact de Sitter action, the analytic gravitational suppression, the Hawking–Moss criterion, the negative-mode structure, the past-light-cone volume and the scope estimates), and the manuscript is built from the stored results, so the text cannot diverge from the computation.</w:t>
+        <w:t>The analysis is fully reproducible. The code (Python, MIT licence) and the data behind every figure and table are at https://github.com/sandlerleon/late-time-vacuum-decay and archived at https://doi.org/10.5281/zenodo.23818442; the manuscript is archived at https://doi.org/10.5281/zenodo.23818441. The repository contains 32 executable checks (against the thin-wall limit, an independent boundary-value solver, the exact de Sitter action, the analytic gravitational suppression, the Hawking–Moss criterion, the negative-mode structure, the past-light-cone volume and the scope estimates), and the manuscript is built from the stored results, so the text cannot diverge from the computation.</w:t>
       </w:r>
     </w:p>
     <w:p>

</xml_diff>

<commit_message>
v1.7.0: density-dependent vacuum interfaces
New Section 7 (old 7-9 renumbered 8-10) and title. Phase maps of both
matter-coupled potentials (symmetron release is spinodal and needs a
coherent seed; tunneling branch metastable below theta = eta/2), wall
tension and density-dependent CDL action, field transmission and wall
pressure, Israel junction, contraction/restoration/bounce of the enclosed
region, energy and entropy closure, controls A-D and a viability map.
Tables 20-21, S20, Figs 23-27, checks V33-V35 (35 in total), 36
interface checks. Zenodo DOIs linked.

Co-Authored-By: Claude Opus 5.5 <noreply@anthropic.com>
</commit_message>
<xml_diff>
--- a/manuscript/EPJC_Cover_Letter.docx
+++ b/manuscript/EPJC_Cover_Letter.docx
@@ -115,7 +115,7 @@
         <w:rPr>
           <w:b w:val="0"/>
         </w:rPr>
-        <w:t>I submit the manuscript “A Cyclic Hot Big Bang Triggered by Matter Dilution: Metastable Dark Energy, Vacuum Release, Recollapse and Nonsingular Cycles without Resets” as a Regular Article (Theoretical Physics) for consideration in The European Physical Journal C.</w:t>
+        <w:t>I submit the manuscript “Matter-Dependent Vacuum Interfaces and a Conditional Cyclic Hot Big Bang: Dilution-Triggered Vacuum Release, Bubble Nucleation and Nonsingular Cycles without Resets” as a Regular Article (Theoretical Physics) for consideration in The European Physical Journal C.</w:t>
       </w:r>
     </w:p>
     <w:p>
@@ -124,6 +124,14 @@
           <w:b w:val="0"/>
         </w:rPr>
         <w:t>The paper asks whether the present dark energy can end the cosmological expansion and start a new hot big bang. The direct route, tunneling of a metastable dark-energy vacuum, fails for reasons that are quantified below. A vacuum held by dark matter and released by dilution does end the expansion: the turnaround follows an exact LambdaCDM past, and an intervention that freezes the matter density seen by the field removes it, so dilution is its cause. This revision then removes every prescribed step from the cycle. With an effective bounce, thermal dissipation and dark matter that obeys its own Boltzmann equation, 100 consecutive cycles were integrated with no reset of any variable; each has a radiation-dominated bounce, a freeze-out to the observed dark-matter ratio, a matter era, a dark-energy epoch and a turnaround, and the entropy produced enlarges the next cycle by (S_n+1/S_n)^(1/3). The revision also reports what the earlier prescribed resets had hidden: a bounce too cold to re-thermalize the dark matter gives an empty next cycle. It adds the conditions on anisotropy (with and without an ekpyrotic phase), an independent bounce mechanism, the black holes of the previous cycle (which bound the bounce temperature from above), a failure-mode map, and the observational consequences, including the negative one that the cycle does not produce the observed primordial perturbations.</w:t>
+      </w:r>
+    </w:p>
+    <w:p>
+      <w:r>
+        <w:rPr>
+          <w:b w:val="0"/>
+        </w:rPr>
+        <w:t>Following a further review, this version adds a section on density-dependent vacuum interfaces (Section 7). It maps where tunneling is meaningful: the symmetron release of the main model is a classical roll and needs a coherent seed or a tilt to avoid domain walls, while a coupling centred on the false vacuum makes the held vacuum metastable below a degeneracy density. For that branch the wall tension, the density-dependent action, the transmission of fields through the wall, the Israel junction and the evolution of the enclosed region are computed, with energy and entropy closure and controls that remove the matter coupling or the selectivity. The wall runs away and becomes transparent to the dark matter within a millimetre, so its mass-selective transmission has no cosmological effect; the enclosed region contracts, is restored by the dark matter and bounces in self-similar cycles; and without the coupling the restoration fails and a transition requires a tuned action. The title now reflects this content and states that the cycle is conditional.</w:t>
       </w:r>
     </w:p>
     <w:p>
@@ -179,7 +187,7 @@
         <w:rPr>
           <w:b w:val="0"/>
         </w:rPr>
-        <w:t>The analysis is fully reproducible. The code (Python, MIT licence) and the data behind every figure and table are at https://github.com/sandlerleon/late-time-vacuum-decay and archived at https://doi.org/10.5281/zenodo.23818442; the manuscript is archived at https://doi.org/10.5281/zenodo.23818441. The repository contains 32 executable checks (against the thin-wall limit, an independent boundary-value solver, the exact de Sitter action, the analytic gravitational suppression, the Hawking–Moss criterion, the negative-mode structure, the past-light-cone volume and the scope estimates), and the manuscript is built from the stored results, so the text cannot diverge from the computation.</w:t>
+        <w:t>The analysis is fully reproducible. The code (Python, MIT licence) and the data behind every figure and table are at https://github.com/sandlerleon/late-time-vacuum-decay and archived at https://doi.org/10.5281/zenodo.23823733; the manuscript is archived at https://doi.org/10.5281/zenodo.23823727. The repository contains 35 executable checks (against the thin-wall limit, an independent boundary-value solver, the exact de Sitter action, the analytic gravitational suppression, the Hawking–Moss criterion, the negative-mode structure, the past-light-cone volume and the scope estimates), and the manuscript is built from the stored results, so the text cannot diverge from the computation.</w:t>
       </w:r>
     </w:p>
     <w:p>

</xml_diff>

<commit_message>
v1.8.0: hand-off from the wall to the cycle, viability Monte Carlo
Section 7.6: percolation (completion in 0.02 Hubble times, collisions at
0.8% of the Hubble scale), collision products bracketed by w = 1/3 and
w = 0, bounds on the ultra-relativistic wall (NLO gauge friction, GWs,
black holes), isolated bubbles trapped behind a horizon before their
bounce, bounce-form and rho_c variants, independent integration.
Section 7.7: viability Monte Carlo over stated ranges. Conditional
wording of the interface claims, background-only scope, the dilution-
as-trigger framing in the introduction and cover letter; validation
table moved to the supplement (S21); Table 20, Fig. 27, check V36 (36).

Co-Authored-By: Claude Opus 5.5 <noreply@anthropic.com>
</commit_message>
<xml_diff>
--- a/manuscript/EPJC_Cover_Letter.docx
+++ b/manuscript/EPJC_Cover_Letter.docx
@@ -131,7 +131,15 @@
         <w:rPr>
           <w:b w:val="0"/>
         </w:rPr>
-        <w:t>Following a further review, this version adds a section on density-dependent vacuum interfaces (Section 7). It maps where tunneling is meaningful: the symmetron release of the main model is a classical roll and needs a coherent seed or a tilt to avoid domain walls, while a coupling centred on the false vacuum makes the held vacuum metastable below a degeneracy density. For that branch the wall tension, the density-dependent action, the transmission of fields through the wall, the Israel junction and the evolution of the enclosed region are computed, with energy and entropy closure and controls that remove the matter coupling or the selectivity. The wall runs away and becomes transparent to the dark matter within a millimetre, so its mass-selective transmission has no cosmological effect; the enclosed region contracts, is restored by the dark matter and bounces in self-similar cycles; and without the coupling the restoration fails and a transition requires a tuned action. The title now reflects this content and states that the cycle is conditional.</w:t>
+        <w:t>In plain terms, the paper reverses a common intuition about the far future. The dilution of matter is usually the end state of cosmic evolution, the approach to heat death; here it is the trigger. If the dark energy is the energy of a vacuum held in place by dark matter, the emptying of the universe destabilizes it, and expansion can turn into contraction, a bounce and a new hot phase. What the paper contributes is not any single ingredient (cyclic cosmology, vacuum decay, matter-coupled scalars and effective bounces are established and cited) but their combination into a quantitative cycle that is followed without prescribed steps, with control experiments that remove each ingredient and an explicit map of the conditions under which the cycle fails. Three limits are stated throughout: the bounce is an effective prescription, the interface results hold only for a completed transition, and the model does not produce the observed primordial perturbations, so its claims concern the background cosmology.</w:t>
+      </w:r>
+    </w:p>
+    <w:p>
+      <w:r>
+        <w:rPr>
+          <w:b w:val="0"/>
+        </w:rPr>
+        <w:t>Following a further review, this version adds a section on density-dependent vacuum interfaces (Section 7). It maps where tunneling is meaningful: the symmetron release of the main model is a classical roll and needs a coherent seed or a tilt to avoid domain walls, while a coupling centred on the false vacuum makes the held vacuum metastable below a degeneracy density. For that branch the wall tension, the density-dependent action, the transmission of fields through the wall, the Israel junction and the evolution of the enclosed region are computed, with energy and entropy closure and controls that remove the matter coupling or the selectivity. The wall runs away and becomes transparent to the dark matter within a millimetre, so its mass-selective transmission has no cosmological effect. The hand-off from the walls to the cycle is checked explicitly: a completed transition is homogeneous above the collision scale, and the cycle continues whether the collision products are relativistic or not, whereas an isolated bubble is trapped behind a horizon before its bounce. Within these effective approximations the interface is presented as a conditional extension of the dilution trigger, not as a second demonstrated mechanism. A Monte Carlo over stated parameter ranges reports how often all the conditions hold at once. The title now reflects this content and states that the cycle is conditional.</w:t>
       </w:r>
     </w:p>
     <w:p>
@@ -187,7 +195,7 @@
         <w:rPr>
           <w:b w:val="0"/>
         </w:rPr>
-        <w:t>The analysis is fully reproducible. The code (Python, MIT licence) and the data behind every figure and table are at https://github.com/sandlerleon/late-time-vacuum-decay and archived at https://doi.org/10.5281/zenodo.23823733; the manuscript is archived at https://doi.org/10.5281/zenodo.23823727. The repository contains 35 executable checks (against the thin-wall limit, an independent boundary-value solver, the exact de Sitter action, the analytic gravitational suppression, the Hawking–Moss criterion, the negative-mode structure, the past-light-cone volume and the scope estimates), and the manuscript is built from the stored results, so the text cannot diverge from the computation.</w:t>
+        <w:t>The analysis is fully reproducible. The code (Python, MIT licence) and the data behind every figure and table are at https://github.com/sandlerleon/late-time-vacuum-decay and archived at https://doi.org/10.5281/zenodo.23823733; the manuscript is archived at https://doi.org/10.5281/zenodo.23823727. The repository contains 36 executable checks (against the thin-wall limit, an independent boundary-value solver, the exact de Sitter action, the analytic gravitational suppression, the Hawking–Moss criterion, the negative-mode structure, the past-light-cone volume and the scope estimates), and the manuscript is built from the stored results, so the text cannot diverge from the computation.</w:t>
       </w:r>
     </w:p>
     <w:p>

</xml_diff>

<commit_message>
v1.8.1: language review applied
Rubriq language review merged selectively through copyedit.py, applied to
every prose block of the manuscript, supplement and cover letter at build
time: American spelling, "rethermalize", "approximately" before numbers,
commas after i.e./e.g., closed non- compounds. Rejected: edits that changed
meaning or terminology (vacua -> vacuoles, big bang -> large bang/band,
falsification diagram -> fractal, curvaton -> curvature, sub-Planckian ->
subPlanckian, stress-energy -> stress energy, dropped labels). Equations,
figures and tables unchanged; all 36 checks pass.

Co-Authored-By: Claude Opus 5.5 <noreply@anthropic.com>
</commit_message>
<xml_diff>
--- a/manuscript/EPJC_Cover_Letter.docx
+++ b/manuscript/EPJC_Cover_Letter.docx
@@ -123,7 +123,7 @@
         <w:rPr>
           <w:b w:val="0"/>
         </w:rPr>
-        <w:t>The paper asks whether the present dark energy can end the cosmological expansion and start a new hot big bang. The direct route, tunneling of a metastable dark-energy vacuum, fails for reasons that are quantified below. A vacuum held by dark matter and released by dilution does end the expansion: the turnaround follows an exact LambdaCDM past, and an intervention that freezes the matter density seen by the field removes it, so dilution is its cause. This revision then removes every prescribed step from the cycle. With an effective bounce, thermal dissipation and dark matter that obeys its own Boltzmann equation, 100 consecutive cycles were integrated with no reset of any variable; each has a radiation-dominated bounce, a freeze-out to the observed dark-matter ratio, a matter era, a dark-energy epoch and a turnaround, and the entropy produced enlarges the next cycle by (S_n+1/S_n)^(1/3). The revision also reports what the earlier prescribed resets had hidden: a bounce too cold to re-thermalize the dark matter gives an empty next cycle. It adds the conditions on anisotropy (with and without an ekpyrotic phase), an independent bounce mechanism, the black holes of the previous cycle (which bound the bounce temperature from above), a failure-mode map, and the observational consequences, including the negative one that the cycle does not produce the observed primordial perturbations.</w:t>
+        <w:t>The paper asks whether the present dark energy can end the cosmological expansion and start a new hot big bang. The direct route, tunneling of a metastable dark-energy vacuum, fails for reasons that are quantified below. A vacuum held by dark matter and released by dilution does end the expansion: the turnaround follows an exact LambdaCDM past, and an intervention that freezes the matter density seen by the field removes it, so dilution is its cause. This revision then removes every prescribed step from the cycle. With an effective bounce, thermal dissipation and dark matter that obeys its own Boltzmann equation, 100 consecutive cycles were integrated with no reset of any variable; each has a radiation-dominated bounce, a freeze-out to the observed dark-matter ratio, a matter era, a dark-energy epoch and a turnaround, and the entropy produced enlarges the next cycle by (S_n+1/S_n)^(1/3). The revision also reports what the earlier prescribed resets had hidden: a bounce too cold to rethermalize the dark matter gives an empty next cycle. It adds the conditions on anisotropy (with and without an ekpyrotic phase), an independent bounce mechanism, the black holes of the previous cycle (which bound the bounce temperature from above), a failure-mode map, and the observational consequences, including the negative one that the cycle does not produce the observed primordial perturbations.</w:t>
       </w:r>
     </w:p>
     <w:p>
@@ -139,7 +139,7 @@
         <w:rPr>
           <w:b w:val="0"/>
         </w:rPr>
-        <w:t>Following a further review, this version adds a section on density-dependent vacuum interfaces (Section 7). It maps where tunneling is meaningful: the symmetron release of the main model is a classical roll and needs a coherent seed or a tilt to avoid domain walls, while a coupling centred on the false vacuum makes the held vacuum metastable below a degeneracy density. For that branch the wall tension, the density-dependent action, the transmission of fields through the wall, the Israel junction and the evolution of the enclosed region are computed, with energy and entropy closure and controls that remove the matter coupling or the selectivity. The wall runs away and becomes transparent to the dark matter within a millimetre, so its mass-selective transmission has no cosmological effect. The hand-off from the walls to the cycle is checked explicitly: a completed transition is homogeneous above the collision scale, and the cycle continues whether the collision products are relativistic or not, whereas an isolated bubble is trapped behind a horizon before its bounce. Within these effective approximations the interface is presented as a conditional extension of the dilution trigger, not as a second demonstrated mechanism. A Monte Carlo over stated parameter ranges reports how often all the conditions hold at once. The title now reflects this content and states that the cycle is conditional.</w:t>
+        <w:t>Following a further review, this version adds a section on density-dependent vacuum interfaces (Section 7). It maps where tunneling is meaningful: the symmetron release of the main model is a classical roll and needs a coherent seed or a tilt to avoid domain walls, while a coupling centered on the false vacuum makes the held vacuum metastable below a degeneracy density. For that branch the wall tension, the density-dependent action, the transmission of fields through the wall, the Israel junction and the evolution of the enclosed region are computed, with energy and entropy closure and controls that remove the matter coupling or the selectivity. The wall runs away and becomes transparent to the dark matter within a millimeter, so its mass-selective transmission has no cosmological effect. The hand-off from the walls to the cycle is checked explicitly: a completed transition is homogeneous above the collision scale, and the cycle continues whether the collision products are relativistic or not, whereas an isolated bubble is trapped behind a horizon before its bounce. Within these effective approximations the interface is presented as a conditional extension of the dilution trigger, not as a second demonstrated mechanism. A Monte Carlo over stated parameter ranges reports how often all the conditions hold at once. The title now reflects this content and states that the cycle is conditional.</w:t>
       </w:r>
     </w:p>
     <w:p>
@@ -147,7 +147,7 @@
         <w:rPr>
           <w:b w:val="0"/>
         </w:rPr>
-        <w:t>For the direct route the answer is negative. A scalar potential with an explicit metastable minimum is specified, the Coleman–De Luccia bounce is solved numerically in flat space and with Einstein gravity, and the action is converted to a nucleation rate with the measured dark-energy density as the false-vacuum energy. With all scales set by the dark energy the gravitational parameter is of order 10⁻⁶⁰, so gravity and the Hawking–Moss channel play no role and the decay is controlled by a single action, which must lie near 287 for a transition on cosmological time scales. The survival of the present vacuum is evaluated on the Lorentzian past light cone of the observed expansion history (0.059 Hubble four-volumes, 445 times smaller than the Euclidean four-sphere often used as a shortcut), which makes the survival condition a weak one. The nucleated region reheats to at most about 2.2 meV, and the reason is not only energy conservation: the open interior stays curvature dominated, so that a hot epoch at one second would require a parent energy scale at least 41 orders of magnitude above the Planck scale. A trigger by matter dilution requires a change of the matter mass between the vacua of at least about 0.1%.</w:t>
+        <w:t>For the direct route the answer is negative. A scalar potential with an explicit metastable minimum is specified, the Coleman–De Luccia bounce is solved numerically in flat space and with Einstein gravity, and the action is converted to a nucleation rate with the measured dark-energy density as the false-vacuum energy. With all scales set by the dark energy the gravitational parameter is of order 10⁻⁶⁰, so gravity and the Hawking–Moss channel play no role and the decay is controlled by a single action, which must lie near 287 for a transition on cosmological time scales. The survival of the present vacuum is evaluated on the Lorentzian past light cone of the observed expansion history (0.059 Hubble four-volumes, 445 times smaller than the Euclidean four-sphere often used as a shortcut), which makes the survival condition a weak one. The nucleated region reheats to at most approximately 2.2 meV, and the reason is not only energy conservation: the open interior stays curvature dominated, so that a hot epoch at one second would require a parent energy scale at least 41 orders of magnitude above the Planck scale. A trigger by matter dilution requires a change of the matter mass between the vacua of at least approximately 0.1%.</w:t>
       </w:r>
     </w:p>
     <w:p>
@@ -171,7 +171,7 @@
         <w:rPr>
           <w:b w:val="0"/>
         </w:rPr>
-        <w:t>The same region oscillating (Option B) is tested as well, with an effective loop-quantum-cosmology bounce and the turnaround supplied by the decay to anti-de Sitter: radiation-only cycles are periodic over a thousand bounces, but a scalar excitation is amplified at every bounce, the turnaround radius follows the energy-balance law Delta a_max = W/3 with W the pressure-volume loop, the cycles are stable only when dissipation per cycle exceeds the logarithm of the amplification, and a vacuum transition during the cycles destabilises them. Cosmological hysteresis itself is known; the stability boundary, the law in this setting and the effect of a transition are what the paper adds.</w:t>
+        <w:t>The same region oscillating (Option B) is tested as well, with an effective loop-quantum-cosmology bounce and the turnaround supplied by the decay to anti-de Sitter: radiation-only cycles are periodic over a thousand bounces, but a scalar excitation is amplified at every bounce, the turnaround radius follows the energy-balance law Delta a_max = W/3 with W the pressure-volume loop, the cycles are stable only when dissipation per cycle exceeds the logarithm of the amplification, and a vacuum transition during the cycles destabilizes them. Cosmological hysteresis itself is known; the stability boundary, the law in this setting and the effect of a transition are what the paper adds.</w:t>
       </w:r>
     </w:p>
     <w:p>
@@ -195,7 +195,7 @@
         <w:rPr>
           <w:b w:val="0"/>
         </w:rPr>
-        <w:t>The analysis is fully reproducible. The code (Python, MIT licence) and the data behind every figure and table are at https://github.com/sandlerleon/late-time-vacuum-decay and archived at https://doi.org/10.5281/zenodo.23823733; the manuscript is archived at https://doi.org/10.5281/zenodo.23823727. The repository contains 36 executable checks (against the thin-wall limit, an independent boundary-value solver, the exact de Sitter action, the analytic gravitational suppression, the Hawking–Moss criterion, the negative-mode structure, the past-light-cone volume and the scope estimates), and the manuscript is built from the stored results, so the text cannot diverge from the computation.</w:t>
+        <w:t>The analysis is fully reproducible. The code (Python, MIT license) and the data behind every figure and table are at https://github.com/sandlerleon/late-time-vacuum-decay and archived at https://doi.org/10.5281/zenodo.23823733; the manuscript is archived at https://doi.org/10.5281/zenodo.23823727. The repository contains 36 executable checks (against the thin-wall limit, an independent boundary-value solver, the exact de Sitter action, the analytic gravitational suppression, the Hawking–Moss criterion, the negative-mode structure, the past-light-cone volume and the scope estimates), and the manuscript is built from the stored results, so the text cannot diverge from the computation.</w:t>
       </w:r>
     </w:p>
     <w:p>

</xml_diff>

<commit_message>
v2.0.0: Zenodo DOIs (paper 10.5281/zenodo.23841870, code 10.5281/zenodo.23841872), companion link
Co-Authored-By: Claude Opus 5.5 <noreply@anthropic.com>
</commit_message>
<xml_diff>
--- a/manuscript/EPJC_Cover_Letter.docx
+++ b/manuscript/EPJC_Cover_Letter.docx
@@ -147,7 +147,7 @@
         <w:rPr>
           <w:b w:val="0"/>
         </w:rPr>
-        <w:t>Related submission. An earlier, broader version of this work also contained an analysis of localized vacuum bubbles. Following a review, that part has been separated into an independent companion manuscript on density-dependent vacuum bubble nucleation, which is in preparation for separate submission to Physics of the Dark Universe. The two papers share the class of models; neither relies on the results of the other, and I will provide the companion manuscript on request.</w:t>
+        <w:t>Related submission. An earlier, broader version of this work also contained an analysis of localized vacuum bubbles. Following a review, that part has been separated into an independent companion manuscript on density-dependent vacuum bubble nucleation, which is in preparation for separate submission to Physics of the Dark Universe (preprint https://doi.org/10.5281/zenodo.23841874). The two papers share the class of models; neither relies on the results of the other, and I will provide the companion manuscript on request.</w:t>
       </w:r>
     </w:p>
     <w:p>
@@ -155,7 +155,7 @@
         <w:rPr>
           <w:b w:val="0"/>
         </w:rPr>
-        <w:t>The analysis is fully reproducible. The code (Python, MIT license) and the data behind every figure and table are at https://github.com/sandlerleon/late-time-vacuum-decay and archived at https://doi.org/10.5281/zenodo.23717618; the manuscript is archived at https://doi.org/10.5281/zenodo.23717616. The manuscript is built from the stored results and only if the executable checks pass.</w:t>
+        <w:t>The analysis is fully reproducible. The code (Python, MIT license) and the data behind every figure and table are at https://github.com/sandlerleon/late-time-vacuum-decay and archived at https://doi.org/10.5281/zenodo.23841872; the manuscript is archived at https://doi.org/10.5281/zenodo.23841870. The manuscript is built from the stored results and only if the executable checks pass.</w:t>
       </w:r>
     </w:p>
     <w:p>

</xml_diff>